<commit_message>
deal screen: update paper.docx
</commit_message>
<xml_diff>
--- a/hub/static/research/companies/paper.docx
+++ b/hub/static/research/companies/paper.docx
@@ -77,7 +77,7 @@
           <w:color w:val="1A1A1A"/>
           <w:sz w:val="32"/>
         </w:rPr>
-        <w:t>2.6 / 4.0</w:t>
+        <w:t>0.0 / 4.0</w:t>
       </w:r>
       <w:r>
         <w:rPr>
@@ -87,7 +87,7 @@
           <w:color w:val="828282"/>
           <w:sz w:val="21"/>
         </w:rPr>
-        <w:t xml:space="preserve">   (raw 2.6)</w:t>
+        <w:t xml:space="preserve">   (raw 0.0)</w:t>
       </w:r>
       <w:r>
         <w:rPr>
@@ -185,618 +185,6 @@
           </w:p>
         </w:tc>
       </w:tr>
-      <w:tr>
-        <w:tc>
-          <w:tcPr>
-            <w:tcW w:type="dxa" w:w="2664"/>
-            <w:shd w:val="clear" w:color="auto" w:fill="F5F5F5"/>
-            <w:tcMar>
-              <w:top w:w="40" w:type="dxa"/>
-              <w:bottom w:w="40" w:type="dxa"/>
-              <w:left w:w="60" w:type="dxa"/>
-              <w:right w:w="60" w:type="dxa"/>
-            </w:tcMar>
-            <w:tcBorders>
-              <w:top w:val="nil"/>
-              <w:left w:val="nil"/>
-              <w:right w:val="nil"/>
-              <w:bottom w:val="single" w:sz="4" w:color="E4DFD5"/>
-            </w:tcBorders>
-          </w:tcPr>
-          <w:p>
-            <w:r>
-              <w:rPr>
-                <w:rFonts w:ascii="Sora" w:hAnsi="Sora"/>
-                <w:b w:val="0"/>
-                <w:caps w:val="0"/>
-                <w:color w:val="1A1A1A"/>
-                <w:sz w:val="19"/>
-              </w:rPr>
-              <w:t>Lead / Round Dynamics</w:t>
-            </w:r>
-          </w:p>
-        </w:tc>
-        <w:tc>
-          <w:tcPr>
-            <w:tcW w:type="dxa" w:w="792"/>
-            <w:shd w:val="clear" w:color="auto" w:fill="F5F5F5"/>
-            <w:tcMar>
-              <w:top w:w="40" w:type="dxa"/>
-              <w:bottom w:w="40" w:type="dxa"/>
-              <w:left w:w="60" w:type="dxa"/>
-              <w:right w:w="60" w:type="dxa"/>
-            </w:tcMar>
-            <w:tcBorders>
-              <w:top w:val="nil"/>
-              <w:left w:val="nil"/>
-              <w:right w:val="nil"/>
-              <w:bottom w:val="single" w:sz="4" w:color="E4DFD5"/>
-            </w:tcBorders>
-          </w:tcPr>
-          <w:p>
-            <w:r>
-              <w:rPr>
-                <w:rFonts w:ascii="Sora" w:hAnsi="Sora"/>
-                <w:b/>
-                <w:caps w:val="0"/>
-                <w:color w:val="1A1A1A"/>
-                <w:sz w:val="19"/>
-              </w:rPr>
-              <w:t>3.1</w:t>
-            </w:r>
-            <w:r>
-              <w:rPr>
-                <w:rFonts w:ascii="Sora" w:hAnsi="Sora"/>
-                <w:b w:val="0"/>
-                <w:caps w:val="0"/>
-                <w:color w:val="828282"/>
-                <w:sz w:val="17"/>
-              </w:rPr>
-              <w:t xml:space="preserve"> / 4</w:t>
-            </w:r>
-          </w:p>
-        </w:tc>
-        <w:tc>
-          <w:tcPr>
-            <w:tcW w:type="dxa" w:w="5904"/>
-            <w:shd w:val="clear" w:color="auto" w:fill="F5F5F5"/>
-            <w:tcMar>
-              <w:top w:w="40" w:type="dxa"/>
-              <w:bottom w:w="40" w:type="dxa"/>
-              <w:left w:w="60" w:type="dxa"/>
-              <w:right w:w="60" w:type="dxa"/>
-            </w:tcMar>
-            <w:tcBorders>
-              <w:top w:val="nil"/>
-              <w:left w:val="nil"/>
-              <w:right w:val="nil"/>
-              <w:bottom w:val="single" w:sz="4" w:color="E4DFD5"/>
-            </w:tcBorders>
-          </w:tcPr>
-          <w:p>
-            <w:r>
-              <w:rPr>
-                <w:rFonts w:ascii="Sora" w:hAnsi="Sora"/>
-                <w:b w:val="0"/>
-                <w:caps w:val="0"/>
-                <w:color w:val="3C3C3C"/>
-                <w:sz w:val="18"/>
-              </w:rPr>
-              <w:t>Series A is led by new-money Tier 1+ Accel and ICONIQ, with Accel re-upping from seed; stage is Series A, outside mandate.[2][8][18]</w:t>
-            </w:r>
-          </w:p>
-        </w:tc>
-      </w:tr>
-      <w:tr>
-        <w:tc>
-          <w:tcPr>
-            <w:tcW w:type="dxa" w:w="2664"/>
-            <w:shd w:val="clear" w:color="auto" w:fill="FFFFFF"/>
-            <w:tcMar>
-              <w:top w:w="40" w:type="dxa"/>
-              <w:bottom w:w="40" w:type="dxa"/>
-              <w:left w:w="60" w:type="dxa"/>
-              <w:right w:w="60" w:type="dxa"/>
-            </w:tcMar>
-            <w:tcBorders>
-              <w:top w:val="nil"/>
-              <w:left w:val="nil"/>
-              <w:right w:val="nil"/>
-              <w:bottom w:val="single" w:sz="4" w:color="E4DFD5"/>
-            </w:tcBorders>
-          </w:tcPr>
-          <w:p>
-            <w:r>
-              <w:rPr>
-                <w:rFonts w:ascii="Sora" w:hAnsi="Sora"/>
-                <w:b w:val="0"/>
-                <w:caps w:val="0"/>
-                <w:color w:val="1A1A1A"/>
-                <w:sz w:val="19"/>
-              </w:rPr>
-              <w:t>Founder / Team Quality</w:t>
-            </w:r>
-          </w:p>
-        </w:tc>
-        <w:tc>
-          <w:tcPr>
-            <w:tcW w:type="dxa" w:w="792"/>
-            <w:shd w:val="clear" w:color="auto" w:fill="FFFFFF"/>
-            <w:tcMar>
-              <w:top w:w="40" w:type="dxa"/>
-              <w:bottom w:w="40" w:type="dxa"/>
-              <w:left w:w="60" w:type="dxa"/>
-              <w:right w:w="60" w:type="dxa"/>
-            </w:tcMar>
-            <w:tcBorders>
-              <w:top w:val="nil"/>
-              <w:left w:val="nil"/>
-              <w:right w:val="nil"/>
-              <w:bottom w:val="single" w:sz="4" w:color="E4DFD5"/>
-            </w:tcBorders>
-          </w:tcPr>
-          <w:p>
-            <w:r>
-              <w:rPr>
-                <w:rFonts w:ascii="Sora" w:hAnsi="Sora"/>
-                <w:b/>
-                <w:caps w:val="0"/>
-                <w:color w:val="1A1A1A"/>
-                <w:sz w:val="19"/>
-              </w:rPr>
-              <w:t>2.3</w:t>
-            </w:r>
-            <w:r>
-              <w:rPr>
-                <w:rFonts w:ascii="Sora" w:hAnsi="Sora"/>
-                <w:b w:val="0"/>
-                <w:caps w:val="0"/>
-                <w:color w:val="828282"/>
-                <w:sz w:val="17"/>
-              </w:rPr>
-              <w:t xml:space="preserve"> / 4</w:t>
-            </w:r>
-          </w:p>
-        </w:tc>
-        <w:tc>
-          <w:tcPr>
-            <w:tcW w:type="dxa" w:w="5904"/>
-            <w:shd w:val="clear" w:color="auto" w:fill="FFFFFF"/>
-            <w:tcMar>
-              <w:top w:w="40" w:type="dxa"/>
-              <w:bottom w:w="40" w:type="dxa"/>
-              <w:left w:w="60" w:type="dxa"/>
-              <w:right w:w="60" w:type="dxa"/>
-            </w:tcMar>
-            <w:tcBorders>
-              <w:top w:val="nil"/>
-              <w:left w:val="nil"/>
-              <w:right w:val="nil"/>
-              <w:bottom w:val="single" w:sz="4" w:color="E4DFD5"/>
-            </w:tcBorders>
-          </w:tcPr>
-          <w:p>
-            <w:r>
-              <w:rPr>
-                <w:rFonts w:ascii="Sora" w:hAnsi="Sora"/>
-                <w:b w:val="0"/>
-                <w:caps w:val="0"/>
-                <w:color w:val="3C3C3C"/>
-                <w:sz w:val="18"/>
-              </w:rPr>
-              <w:t>Founder Stephen Haney shows some public presence and no red flags, but prior exits, team composition, and recruiting traction remain largely undocumented.[9][13]</w:t>
-            </w:r>
-          </w:p>
-        </w:tc>
-      </w:tr>
-      <w:tr>
-        <w:tc>
-          <w:tcPr>
-            <w:tcW w:type="dxa" w:w="2664"/>
-            <w:shd w:val="clear" w:color="auto" w:fill="F5F5F5"/>
-            <w:tcMar>
-              <w:top w:w="40" w:type="dxa"/>
-              <w:bottom w:w="40" w:type="dxa"/>
-              <w:left w:w="60" w:type="dxa"/>
-              <w:right w:w="60" w:type="dxa"/>
-            </w:tcMar>
-            <w:tcBorders>
-              <w:top w:val="nil"/>
-              <w:left w:val="nil"/>
-              <w:right w:val="nil"/>
-              <w:bottom w:val="single" w:sz="4" w:color="E4DFD5"/>
-            </w:tcBorders>
-          </w:tcPr>
-          <w:p>
-            <w:r>
-              <w:rPr>
-                <w:rFonts w:ascii="Sora" w:hAnsi="Sora"/>
-                <w:b w:val="0"/>
-                <w:caps w:val="0"/>
-                <w:color w:val="1A1A1A"/>
-                <w:sz w:val="19"/>
-              </w:rPr>
-              <w:t>AI Score</w:t>
-            </w:r>
-          </w:p>
-        </w:tc>
-        <w:tc>
-          <w:tcPr>
-            <w:tcW w:type="dxa" w:w="792"/>
-            <w:shd w:val="clear" w:color="auto" w:fill="F5F5F5"/>
-            <w:tcMar>
-              <w:top w:w="40" w:type="dxa"/>
-              <w:bottom w:w="40" w:type="dxa"/>
-              <w:left w:w="60" w:type="dxa"/>
-              <w:right w:w="60" w:type="dxa"/>
-            </w:tcMar>
-            <w:tcBorders>
-              <w:top w:val="nil"/>
-              <w:left w:val="nil"/>
-              <w:right w:val="nil"/>
-              <w:bottom w:val="single" w:sz="4" w:color="E4DFD5"/>
-            </w:tcBorders>
-          </w:tcPr>
-          <w:p>
-            <w:r>
-              <w:rPr>
-                <w:rFonts w:ascii="Sora" w:hAnsi="Sora"/>
-                <w:b/>
-                <w:caps w:val="0"/>
-                <w:color w:val="1A1A1A"/>
-                <w:sz w:val="19"/>
-              </w:rPr>
-              <w:t>2.5</w:t>
-            </w:r>
-            <w:r>
-              <w:rPr>
-                <w:rFonts w:ascii="Sora" w:hAnsi="Sora"/>
-                <w:b w:val="0"/>
-                <w:caps w:val="0"/>
-                <w:color w:val="828282"/>
-                <w:sz w:val="17"/>
-              </w:rPr>
-              <w:t xml:space="preserve"> / 4</w:t>
-            </w:r>
-          </w:p>
-        </w:tc>
-        <w:tc>
-          <w:tcPr>
-            <w:tcW w:type="dxa" w:w="5904"/>
-            <w:shd w:val="clear" w:color="auto" w:fill="F5F5F5"/>
-            <w:tcMar>
-              <w:top w:w="40" w:type="dxa"/>
-              <w:bottom w:w="40" w:type="dxa"/>
-              <w:left w:w="60" w:type="dxa"/>
-              <w:right w:w="60" w:type="dxa"/>
-            </w:tcMar>
-            <w:tcBorders>
-              <w:top w:val="nil"/>
-              <w:left w:val="nil"/>
-              <w:right w:val="nil"/>
-              <w:bottom w:val="single" w:sz="4" w:color="E4DFD5"/>
-            </w:tcBorders>
-          </w:tcPr>
-          <w:p>
-            <w:r>
-              <w:rPr>
-                <w:rFonts w:ascii="Sora" w:hAnsi="Sora"/>
-                <w:b w:val="0"/>
-                <w:caps w:val="0"/>
-                <w:color w:val="3C3C3C"/>
-                <w:sz w:val="18"/>
-              </w:rPr>
-              <w:t>Paper is an AI-native design canvas integrating multiple external agents and accumulating proprietary design-system data, but owns no core models itself.[1][7][17]</w:t>
-            </w:r>
-          </w:p>
-        </w:tc>
-      </w:tr>
-      <w:tr>
-        <w:tc>
-          <w:tcPr>
-            <w:tcW w:type="dxa" w:w="2664"/>
-            <w:shd w:val="clear" w:color="auto" w:fill="FFFFFF"/>
-            <w:tcMar>
-              <w:top w:w="40" w:type="dxa"/>
-              <w:bottom w:w="40" w:type="dxa"/>
-              <w:left w:w="60" w:type="dxa"/>
-              <w:right w:w="60" w:type="dxa"/>
-            </w:tcMar>
-            <w:tcBorders>
-              <w:top w:val="nil"/>
-              <w:left w:val="nil"/>
-              <w:right w:val="nil"/>
-              <w:bottom w:val="single" w:sz="4" w:color="E4DFD5"/>
-            </w:tcBorders>
-          </w:tcPr>
-          <w:p>
-            <w:r>
-              <w:rPr>
-                <w:rFonts w:ascii="Sora" w:hAnsi="Sora"/>
-                <w:b w:val="0"/>
-                <w:caps w:val="0"/>
-                <w:color w:val="1A1A1A"/>
-                <w:sz w:val="19"/>
-              </w:rPr>
-              <w:t>Terms</w:t>
-            </w:r>
-          </w:p>
-        </w:tc>
-        <w:tc>
-          <w:tcPr>
-            <w:tcW w:type="dxa" w:w="792"/>
-            <w:shd w:val="clear" w:color="auto" w:fill="FFFFFF"/>
-            <w:tcMar>
-              <w:top w:w="40" w:type="dxa"/>
-              <w:bottom w:w="40" w:type="dxa"/>
-              <w:left w:w="60" w:type="dxa"/>
-              <w:right w:w="60" w:type="dxa"/>
-            </w:tcMar>
-            <w:tcBorders>
-              <w:top w:val="nil"/>
-              <w:left w:val="nil"/>
-              <w:right w:val="nil"/>
-              <w:bottom w:val="single" w:sz="4" w:color="E4DFD5"/>
-            </w:tcBorders>
-          </w:tcPr>
-          <w:p>
-            <w:r>
-              <w:rPr>
-                <w:rFonts w:ascii="Sora" w:hAnsi="Sora"/>
-                <w:b/>
-                <w:caps w:val="0"/>
-                <w:color w:val="1A1A1A"/>
-                <w:sz w:val="19"/>
-              </w:rPr>
-              <w:t>3.0</w:t>
-            </w:r>
-            <w:r>
-              <w:rPr>
-                <w:rFonts w:ascii="Sora" w:hAnsi="Sora"/>
-                <w:b w:val="0"/>
-                <w:caps w:val="0"/>
-                <w:color w:val="828282"/>
-                <w:sz w:val="17"/>
-              </w:rPr>
-              <w:t xml:space="preserve"> / 4</w:t>
-            </w:r>
-          </w:p>
-        </w:tc>
-        <w:tc>
-          <w:tcPr>
-            <w:tcW w:type="dxa" w:w="5904"/>
-            <w:shd w:val="clear" w:color="auto" w:fill="FFFFFF"/>
-            <w:tcMar>
-              <w:top w:w="40" w:type="dxa"/>
-              <w:bottom w:w="40" w:type="dxa"/>
-              <w:left w:w="60" w:type="dxa"/>
-              <w:right w:w="60" w:type="dxa"/>
-            </w:tcMar>
-            <w:tcBorders>
-              <w:top w:val="nil"/>
-              <w:left w:val="nil"/>
-              <w:right w:val="nil"/>
-              <w:bottom w:val="single" w:sz="4" w:color="E4DFD5"/>
-            </w:tcBorders>
-          </w:tcPr>
-          <w:p>
-            <w:r>
-              <w:rPr>
-                <w:rFonts w:ascii="Sora" w:hAnsi="Sora"/>
-                <w:b w:val="0"/>
-                <w:caps w:val="0"/>
-                <w:color w:val="3C3C3C"/>
-                <w:sz w:val="18"/>
-              </w:rPr>
-              <w:t>No adverse term signals are public, so we assume standard 0/0/10-style venture economics for future co-invest opportunities.[2][8]</w:t>
-            </w:r>
-          </w:p>
-        </w:tc>
-      </w:tr>
-      <w:tr>
-        <w:tc>
-          <w:tcPr>
-            <w:tcW w:type="dxa" w:w="2664"/>
-            <w:shd w:val="clear" w:color="auto" w:fill="F5F5F5"/>
-            <w:tcMar>
-              <w:top w:w="40" w:type="dxa"/>
-              <w:bottom w:w="40" w:type="dxa"/>
-              <w:left w:w="60" w:type="dxa"/>
-              <w:right w:w="60" w:type="dxa"/>
-            </w:tcMar>
-            <w:tcBorders>
-              <w:top w:val="nil"/>
-              <w:left w:val="nil"/>
-              <w:right w:val="nil"/>
-              <w:bottom w:val="single" w:sz="4" w:color="E4DFD5"/>
-            </w:tcBorders>
-          </w:tcPr>
-          <w:p>
-            <w:r>
-              <w:rPr>
-                <w:rFonts w:ascii="Sora" w:hAnsi="Sora"/>
-                <w:b w:val="0"/>
-                <w:caps w:val="0"/>
-                <w:color w:val="1A1A1A"/>
-                <w:sz w:val="19"/>
-              </w:rPr>
-              <w:t>Fundamentals</w:t>
-            </w:r>
-          </w:p>
-        </w:tc>
-        <w:tc>
-          <w:tcPr>
-            <w:tcW w:type="dxa" w:w="792"/>
-            <w:shd w:val="clear" w:color="auto" w:fill="F5F5F5"/>
-            <w:tcMar>
-              <w:top w:w="40" w:type="dxa"/>
-              <w:bottom w:w="40" w:type="dxa"/>
-              <w:left w:w="60" w:type="dxa"/>
-              <w:right w:w="60" w:type="dxa"/>
-            </w:tcMar>
-            <w:tcBorders>
-              <w:top w:val="nil"/>
-              <w:left w:val="nil"/>
-              <w:right w:val="nil"/>
-              <w:bottom w:val="single" w:sz="4" w:color="E4DFD5"/>
-            </w:tcBorders>
-          </w:tcPr>
-          <w:p>
-            <w:r>
-              <w:rPr>
-                <w:rFonts w:ascii="Sora" w:hAnsi="Sora"/>
-                <w:b/>
-                <w:caps w:val="0"/>
-                <w:color w:val="1A1A1A"/>
-                <w:sz w:val="19"/>
-              </w:rPr>
-              <w:t>2.3</w:t>
-            </w:r>
-            <w:r>
-              <w:rPr>
-                <w:rFonts w:ascii="Sora" w:hAnsi="Sora"/>
-                <w:b w:val="0"/>
-                <w:caps w:val="0"/>
-                <w:color w:val="828282"/>
-                <w:sz w:val="17"/>
-              </w:rPr>
-              <w:t xml:space="preserve"> / 4</w:t>
-            </w:r>
-          </w:p>
-        </w:tc>
-        <w:tc>
-          <w:tcPr>
-            <w:tcW w:type="dxa" w:w="5904"/>
-            <w:shd w:val="clear" w:color="auto" w:fill="F5F5F5"/>
-            <w:tcMar>
-              <w:top w:w="40" w:type="dxa"/>
-              <w:bottom w:w="40" w:type="dxa"/>
-              <w:left w:w="60" w:type="dxa"/>
-              <w:right w:w="60" w:type="dxa"/>
-            </w:tcMar>
-            <w:tcBorders>
-              <w:top w:val="nil"/>
-              <w:left w:val="nil"/>
-              <w:right w:val="nil"/>
-              <w:bottom w:val="single" w:sz="4" w:color="E4DFD5"/>
-            </w:tcBorders>
-          </w:tcPr>
-          <w:p>
-            <w:r>
-              <w:rPr>
-                <w:rFonts w:ascii="Sora" w:hAnsi="Sora"/>
-                <w:b w:val="0"/>
-                <w:caps w:val="0"/>
-                <w:color w:val="3C3C3C"/>
-                <w:sz w:val="18"/>
-              </w:rPr>
-              <w:t>Financial metrics are undisclosed, but AI-centric workflow moat and large professional design TAM suggest early yet scalable fundamentals, with limited visibility into efficiency or concentration.[1][2][6]</w:t>
-            </w:r>
-          </w:p>
-        </w:tc>
-      </w:tr>
-      <w:tr>
-        <w:tc>
-          <w:tcPr>
-            <w:tcW w:type="dxa" w:w="2664"/>
-            <w:shd w:val="clear" w:color="auto" w:fill="FFFFFF"/>
-            <w:tcMar>
-              <w:top w:w="40" w:type="dxa"/>
-              <w:bottom w:w="40" w:type="dxa"/>
-              <w:left w:w="60" w:type="dxa"/>
-              <w:right w:w="60" w:type="dxa"/>
-            </w:tcMar>
-            <w:tcBorders>
-              <w:top w:val="nil"/>
-              <w:left w:val="nil"/>
-              <w:right w:val="nil"/>
-              <w:bottom w:val="single" w:sz="4" w:color="E4DFD5"/>
-            </w:tcBorders>
-          </w:tcPr>
-          <w:p>
-            <w:r>
-              <w:rPr>
-                <w:rFonts w:ascii="Sora" w:hAnsi="Sora"/>
-                <w:b w:val="0"/>
-                <w:caps w:val="0"/>
-                <w:color w:val="1A1A1A"/>
-                <w:sz w:val="19"/>
-              </w:rPr>
-              <w:t>Return Potential</w:t>
-            </w:r>
-          </w:p>
-        </w:tc>
-        <w:tc>
-          <w:tcPr>
-            <w:tcW w:type="dxa" w:w="792"/>
-            <w:shd w:val="clear" w:color="auto" w:fill="FFFFFF"/>
-            <w:tcMar>
-              <w:top w:w="40" w:type="dxa"/>
-              <w:bottom w:w="40" w:type="dxa"/>
-              <w:left w:w="60" w:type="dxa"/>
-              <w:right w:w="60" w:type="dxa"/>
-            </w:tcMar>
-            <w:tcBorders>
-              <w:top w:val="nil"/>
-              <w:left w:val="nil"/>
-              <w:right w:val="nil"/>
-              <w:bottom w:val="single" w:sz="4" w:color="E4DFD5"/>
-            </w:tcBorders>
-          </w:tcPr>
-          <w:p>
-            <w:r>
-              <w:rPr>
-                <w:rFonts w:ascii="Sora" w:hAnsi="Sora"/>
-                <w:b/>
-                <w:caps w:val="0"/>
-                <w:color w:val="1A1A1A"/>
-                <w:sz w:val="19"/>
-              </w:rPr>
-              <w:t>2.4</w:t>
-            </w:r>
-            <w:r>
-              <w:rPr>
-                <w:rFonts w:ascii="Sora" w:hAnsi="Sora"/>
-                <w:b w:val="0"/>
-                <w:caps w:val="0"/>
-                <w:color w:val="828282"/>
-                <w:sz w:val="17"/>
-              </w:rPr>
-              <w:t xml:space="preserve"> / 4</w:t>
-            </w:r>
-          </w:p>
-        </w:tc>
-        <w:tc>
-          <w:tcPr>
-            <w:tcW w:type="dxa" w:w="5904"/>
-            <w:shd w:val="clear" w:color="auto" w:fill="FFFFFF"/>
-            <w:tcMar>
-              <w:top w:w="40" w:type="dxa"/>
-              <w:bottom w:w="40" w:type="dxa"/>
-              <w:left w:w="60" w:type="dxa"/>
-              <w:right w:w="60" w:type="dxa"/>
-            </w:tcMar>
-            <w:tcBorders>
-              <w:top w:val="nil"/>
-              <w:left w:val="nil"/>
-              <w:right w:val="nil"/>
-              <w:bottom w:val="single" w:sz="4" w:color="E4DFD5"/>
-            </w:tcBorders>
-          </w:tcPr>
-          <w:p>
-            <w:r>
-              <w:rPr>
-                <w:rFonts w:ascii="Sora" w:hAnsi="Sora"/>
-                <w:b w:val="0"/>
-                <w:caps w:val="0"/>
-                <w:color w:val="3C3C3C"/>
-                <w:sz w:val="18"/>
-              </w:rPr>
-              <w:t>With a Tier 1+ syndicate, big design TAM, and AI tailwinds, upside appears venture-scale, though entry multiple, dilution, and timelines are still unclear.[1][2][11]</w:t>
-            </w:r>
-          </w:p>
-        </w:tc>
-      </w:tr>
     </w:tbl>
     <w:p>
       <w:pPr>
@@ -834,7 +222,7 @@
           <w:color w:val="1A1A1A"/>
           <w:sz w:val="21"/>
         </w:rPr>
-        <w:t>Paper aligns with ID8's AI thesis via its AI-native design canvas and new-money Tier 1+ co-leads Accel and ICONIQ.[1][2][8] As a Series A round outside ID8's Series B+ mandate, Paper goes on the watch list for future evaluation.[2]</w:t>
+        <w:t>scoring failed: 401 Client Error: Unauthorized for url: https://api.perplexity.ai/chat/completions</w:t>
       </w:r>
     </w:p>
     <w:p>

</xml_diff>